<commit_message>
WMC answer1 answers added for cs2
</commit_message>
<xml_diff>
--- a/MT/Middleware Tech_March 2023 - 16 weeks-Handout.docx
+++ b/MT/Middleware Tech_March 2023 - 16 weeks-Handout.docx
@@ -1,6 +1,6 @@
 
 <file path=word/document.xml><?xml version="1.0" encoding="utf-8"?>
-<w:document xmlns:wpc="http://schemas.microsoft.com/office/word/2010/wordprocessingCanvas" xmlns:mc="http://schemas.openxmlformats.org/markup-compatibility/2006" xmlns:o="urn:schemas-microsoft-com:office:office" xmlns:r="http://schemas.openxmlformats.org/officeDocument/2006/relationships" xmlns:m="http://schemas.openxmlformats.org/officeDocument/2006/math" xmlns:v="urn:schemas-microsoft-com:vml" xmlns:wp14="http://schemas.microsoft.com/office/word/2010/wordprocessingDrawing" xmlns:wp="http://schemas.openxmlformats.org/drawingml/2006/wordprocessingDrawing" xmlns:w10="urn:schemas-microsoft-com:office:word" xmlns:w="http://schemas.openxmlformats.org/wordprocessingml/2006/main" xmlns:w14="http://schemas.microsoft.com/office/word/2010/wordml" xmlns:w15="http://schemas.microsoft.com/office/word/2012/wordml" xmlns:wpg="http://schemas.microsoft.com/office/word/2010/wordprocessingGroup" xmlns:wpi="http://schemas.microsoft.com/office/word/2010/wordprocessingInk" xmlns:wne="http://schemas.microsoft.com/office/word/2006/wordml" xmlns:wps="http://schemas.microsoft.com/office/word/2010/wordprocessingShape" mc:Ignorable="w14 w15 wp14">
+<w:document xmlns:wpc="http://schemas.microsoft.com/office/word/2010/wordprocessingCanvas" xmlns:cx="http://schemas.microsoft.com/office/drawing/2014/chartex" xmlns:cx1="http://schemas.microsoft.com/office/drawing/2015/9/8/chartex" xmlns:cx2="http://schemas.microsoft.com/office/drawing/2015/10/21/chartex" xmlns:cx3="http://schemas.microsoft.com/office/drawing/2016/5/9/chartex" xmlns:cx4="http://schemas.microsoft.com/office/drawing/2016/5/10/chartex" xmlns:cx5="http://schemas.microsoft.com/office/drawing/2016/5/11/chartex" xmlns:cx6="http://schemas.microsoft.com/office/drawing/2016/5/12/chartex" xmlns:cx7="http://schemas.microsoft.com/office/drawing/2016/5/13/chartex" xmlns:cx8="http://schemas.microsoft.com/office/drawing/2016/5/14/chartex" xmlns:mc="http://schemas.openxmlformats.org/markup-compatibility/2006" xmlns:aink="http://schemas.microsoft.com/office/drawing/2016/ink" xmlns:am3d="http://schemas.microsoft.com/office/drawing/2017/model3d" xmlns:o="urn:schemas-microsoft-com:office:office" xmlns:oel="http://schemas.microsoft.com/office/2019/extlst" xmlns:r="http://schemas.openxmlformats.org/officeDocument/2006/relationships" xmlns:m="http://schemas.openxmlformats.org/officeDocument/2006/math" xmlns:v="urn:schemas-microsoft-com:vml" xmlns:wp14="http://schemas.microsoft.com/office/word/2010/wordprocessingDrawing" xmlns:wp="http://schemas.openxmlformats.org/drawingml/2006/wordprocessingDrawing" xmlns:w10="urn:schemas-microsoft-com:office:word" xmlns:w="http://schemas.openxmlformats.org/wordprocessingml/2006/main" xmlns:w14="http://schemas.microsoft.com/office/word/2010/wordml" xmlns:w15="http://schemas.microsoft.com/office/word/2012/wordml" xmlns:w16cex="http://schemas.microsoft.com/office/word/2018/wordml/cex" xmlns:w16cid="http://schemas.microsoft.com/office/word/2016/wordml/cid" xmlns:w16="http://schemas.microsoft.com/office/word/2018/wordml" xmlns:w16du="http://schemas.microsoft.com/office/word/2023/wordml/word16du" xmlns:w16sdtdh="http://schemas.microsoft.com/office/word/2020/wordml/sdtdatahash" xmlns:w16sdtfl="http://schemas.microsoft.com/office/word/2024/wordml/sdtformatlock" xmlns:w16se="http://schemas.microsoft.com/office/word/2015/wordml/symex" xmlns:wpg="http://schemas.microsoft.com/office/word/2010/wordprocessingGroup" xmlns:wpi="http://schemas.microsoft.com/office/word/2010/wordprocessingInk" xmlns:wne="http://schemas.microsoft.com/office/word/2006/wordml" xmlns:wps="http://schemas.microsoft.com/office/word/2010/wordprocessingShape" mc:Ignorable="w14 w15 w16se w16cid w16 w16cex w16sdtdh w16sdtfl w16du wp14">
   <w:body>
     <w:p>
       <w:pPr>
@@ -50,7 +50,7 @@
                     </pic:cNvPicPr>
                   </pic:nvPicPr>
                   <pic:blipFill>
-                    <a:blip r:embed="rId5" cstate="print">
+                    <a:blip r:embed="rId8" cstate="print">
                       <a:extLst>
                         <a:ext uri="{28A0092B-C50C-407E-A947-70E740481C1C}">
                           <a14:useLocalDpi xmlns:a14="http://schemas.microsoft.com/office/drawing/2010/main" val="0"/>
@@ -649,58 +649,8 @@
               <w:rPr>
                 <w:rFonts w:ascii="Times New Roman" w:hAnsi="Times New Roman" w:cs="Times New Roman"/>
               </w:rPr>
-              <w:t xml:space="preserve">Evolution of Middleware Technologies: Transaction Processing, Remote Procedure Calls, Message-Oriented-Middleware, Object Request Brokers, Web services and REST; Forms of Middleware: Enterprise Middleware, Web Middleware, and Cloud / Services Middleware; Middleware Elements: communication protocols, middleware protocols, data representation, server process control, naming and directory services, security, system management; Select case studies such as MS .NET, J2EE. Service Oriented Architecture: Loosely Coupled Systems, Business processes, Tiers, Architectural Choices; Resiliency in Middleware: resiliency techniques, hardware failures, communication failures, software failures; Performance and scalability in Middleware; Security in Middleware; Implementation Aspects: business process implementation, enterprise integration, </w:t>
-            </w:r>
-            <w:proofErr w:type="gramStart"/>
-            <w:r>
-              <w:rPr>
-                <w:rFonts w:ascii="Times New Roman" w:hAnsi="Times New Roman" w:cs="Times New Roman"/>
-              </w:rPr>
-              <w:t>web</w:t>
-            </w:r>
-            <w:proofErr w:type="gramEnd"/>
-            <w:r>
-              <w:rPr>
-                <w:rFonts w:ascii="Times New Roman" w:hAnsi="Times New Roman" w:cs="Times New Roman"/>
-              </w:rPr>
-              <w:t xml:space="preserve"> and database middleware (e.g. NoSQL middleware) change management. Case studies of Enterprise application architecture (EAI) - </w:t>
-            </w:r>
-            <w:proofErr w:type="spellStart"/>
-            <w:r>
-              <w:rPr>
-                <w:rFonts w:ascii="Times New Roman" w:hAnsi="Times New Roman" w:cs="Times New Roman"/>
-              </w:rPr>
-              <w:t>Eg</w:t>
-            </w:r>
-            <w:proofErr w:type="spellEnd"/>
-            <w:r>
-              <w:rPr>
-                <w:rFonts w:ascii="Times New Roman" w:hAnsi="Times New Roman" w:cs="Times New Roman"/>
-              </w:rPr>
-              <w:t xml:space="preserve">. </w:t>
-            </w:r>
-            <w:proofErr w:type="spellStart"/>
-            <w:r>
-              <w:rPr>
-                <w:rFonts w:ascii="Times New Roman" w:hAnsi="Times New Roman" w:cs="Times New Roman"/>
-              </w:rPr>
-              <w:t>Tibco</w:t>
-            </w:r>
-            <w:proofErr w:type="spellEnd"/>
-            <w:r>
-              <w:rPr>
-                <w:rFonts w:ascii="Times New Roman" w:hAnsi="Times New Roman" w:cs="Times New Roman"/>
-              </w:rPr>
-              <w:t xml:space="preserve">, </w:t>
-            </w:r>
-            <w:proofErr w:type="spellStart"/>
-            <w:r>
-              <w:rPr>
-                <w:rFonts w:ascii="Times New Roman" w:hAnsi="Times New Roman" w:cs="Times New Roman"/>
-              </w:rPr>
-              <w:t>Websphere</w:t>
-            </w:r>
-            <w:proofErr w:type="spellEnd"/>
+              <w:t>Evolution of Middleware Technologies: Transaction Processing, Remote Procedure Calls, Message-Oriented-Middleware, Object Request Brokers, Web services and REST; Forms of Middleware: Enterprise Middleware, Web Middleware, and Cloud / Services Middleware; Middleware Elements: communication protocols, middleware protocols, data representation, server process control, naming and directory services, security, system management; Select case studies such as MS .NET, J2EE. Service Oriented Architecture: Loosely Coupled Systems, Business processes, Tiers, Architectural Choices; Resiliency in Middleware: resiliency techniques, hardware failures, communication failures, software failures; Performance and scalability in Middleware; Security in Middleware; Implementation Aspects: business process implementation, enterprise integration, web and database middleware (e.g. NoSQL middleware) change management. Case studies of Enterprise application architecture (EAI) - Eg. Tibco, Websphere</w:t>
+            </w:r>
           </w:p>
         </w:tc>
       </w:tr>
@@ -850,16 +800,8 @@
               <w:rPr>
                 <w:rFonts w:ascii="Times New Roman" w:hAnsi="Times New Roman" w:cs="Times New Roman"/>
               </w:rPr>
-              <w:t xml:space="preserve">Describe the architecture and applications of CORBA and its elements such as IDLs, naming service, and demonstrate how to deploy an application on Application server such as </w:t>
-            </w:r>
-            <w:proofErr w:type="spellStart"/>
-            <w:r>
-              <w:rPr>
-                <w:rFonts w:ascii="Times New Roman" w:hAnsi="Times New Roman" w:cs="Times New Roman"/>
-              </w:rPr>
-              <w:t>JBoss</w:t>
-            </w:r>
-            <w:proofErr w:type="spellEnd"/>
+              <w:t>Describe the architecture and applications of CORBA and its elements such as IDLs, naming service, and demonstrate how to deploy an application on Application server such as JBoss</w:t>
+            </w:r>
           </w:p>
         </w:tc>
       </w:tr>
@@ -1236,30 +1178,8 @@
               <w:rPr>
                 <w:rFonts w:ascii="Times New Roman" w:hAnsi="Times New Roman" w:cs="Times New Roman"/>
               </w:rPr>
-              <w:t xml:space="preserve">INTRODUCTIONTOMIDDLEWARE (Web Services, Object </w:t>
-            </w:r>
-            <w:proofErr w:type="spellStart"/>
-            <w:r>
-              <w:rPr>
-                <w:rFonts w:ascii="Times New Roman" w:hAnsi="Times New Roman" w:cs="Times New Roman"/>
-              </w:rPr>
-              <w:t>Components,and</w:t>
-            </w:r>
-            <w:proofErr w:type="spellEnd"/>
-            <w:r>
-              <w:rPr>
-                <w:rFonts w:ascii="Times New Roman" w:hAnsi="Times New Roman" w:cs="Times New Roman"/>
-              </w:rPr>
-              <w:t xml:space="preserve"> Cloud Computing) by Letha Hughes </w:t>
-            </w:r>
-            <w:proofErr w:type="spellStart"/>
-            <w:r>
-              <w:rPr>
-                <w:rFonts w:ascii="Times New Roman" w:hAnsi="Times New Roman" w:cs="Times New Roman"/>
-              </w:rPr>
-              <w:t>Etzkorn</w:t>
-            </w:r>
-            <w:proofErr w:type="spellEnd"/>
+              <w:t>INTRODUCTIONTOMIDDLEWARE (Web Services, Object Components,and Cloud Computing) by Letha Hughes Etzkorn</w:t>
+            </w:r>
           </w:p>
         </w:tc>
       </w:tr>
@@ -2058,19 +1978,11 @@
                 <w:rFonts w:ascii="Times New Roman" w:hAnsi="Times New Roman" w:cs="Times New Roman"/>
               </w:rPr>
             </w:pPr>
-            <w:proofErr w:type="spellStart"/>
-            <w:r>
-              <w:rPr>
-                <w:rFonts w:ascii="Times New Roman" w:hAnsi="Times New Roman" w:cs="Times New Roman"/>
-              </w:rPr>
-              <w:t>EAI,Enterprise</w:t>
-            </w:r>
-            <w:proofErr w:type="spellEnd"/>
-            <w:r>
-              <w:rPr>
-                <w:rFonts w:ascii="Times New Roman" w:hAnsi="Times New Roman" w:cs="Times New Roman"/>
-              </w:rPr>
-              <w:t xml:space="preserve"> Bus (e.g. TIBCO)and Publish-Subscribe Models </w:t>
+            <w:r>
+              <w:rPr>
+                <w:rFonts w:ascii="Times New Roman" w:hAnsi="Times New Roman" w:cs="Times New Roman"/>
+              </w:rPr>
+              <w:t xml:space="preserve">EAI,Enterprise Bus (e.g. TIBCO)and Publish-Subscribe Models </w:t>
             </w:r>
           </w:p>
           <w:p>
@@ -2852,21 +2764,7 @@
               <w:rPr>
                 <w:rFonts w:ascii="Times New Roman" w:hAnsi="Times New Roman" w:cs="Times New Roman"/>
               </w:rPr>
-              <w:t xml:space="preserve">Peer-to-Peer systems and Middleware (Overlays, </w:t>
-            </w:r>
-            <w:proofErr w:type="spellStart"/>
-            <w:r>
-              <w:rPr>
-                <w:rFonts w:ascii="Times New Roman" w:hAnsi="Times New Roman" w:cs="Times New Roman"/>
-              </w:rPr>
-              <w:t>SuperPeers</w:t>
-            </w:r>
-            <w:proofErr w:type="spellEnd"/>
-            <w:r>
-              <w:rPr>
-                <w:rFonts w:ascii="Times New Roman" w:hAnsi="Times New Roman" w:cs="Times New Roman"/>
-              </w:rPr>
-              <w:t>)</w:t>
+              <w:t>Peer-to-Peer systems and Middleware (Overlays, SuperPeers)</w:t>
             </w:r>
           </w:p>
           <w:p>
@@ -3600,8 +3498,6 @@
               </w:rPr>
               <w:t>II Semester 2022 - 2023</w:t>
             </w:r>
-            <w:bookmarkStart w:id="1" w:name="_GoBack"/>
-            <w:bookmarkEnd w:id="1"/>
           </w:p>
         </w:tc>
       </w:tr>
@@ -4719,7 +4615,21 @@
                 <w:rFonts w:ascii="Times New Roman" w:eastAsia="Times New Roman" w:hAnsi="Times New Roman" w:cs="Times New Roman"/>
                 <w:lang w:val="en-IN" w:bidi="te-IN"/>
               </w:rPr>
-              <w:t>Cobra basics</w:t>
+              <w:t>Cor</w:t>
+            </w:r>
+            <w:r>
+              <w:rPr>
+                <w:rFonts w:ascii="Times New Roman" w:eastAsia="Times New Roman" w:hAnsi="Times New Roman" w:cs="Times New Roman"/>
+                <w:lang w:val="en-IN" w:bidi="te-IN"/>
+              </w:rPr>
+              <w:t>b</w:t>
+            </w:r>
+            <w:r>
+              <w:rPr>
+                <w:rFonts w:ascii="Times New Roman" w:eastAsia="Times New Roman" w:hAnsi="Times New Roman" w:cs="Times New Roman"/>
+                <w:lang w:val="en-IN" w:bidi="te-IN"/>
+              </w:rPr>
+              <w:t>a basics</w:t>
             </w:r>
           </w:p>
         </w:tc>
@@ -5846,7 +5756,7 @@
                 <w:lang w:bidi="te-IN"/>
               </w:rPr>
             </w:pPr>
-            <w:hyperlink r:id="rId6" w:history="1">
+            <w:hyperlink r:id="rId9" w:history="1">
               <w:r>
                 <w:rPr>
                   <w:rFonts w:ascii="Times New Roman" w:eastAsia="Times New Roman" w:hAnsi="Times New Roman" w:cs="Times New Roman"/>
@@ -6924,30 +6834,14 @@
                 <w:rFonts w:ascii="Times New Roman" w:eastAsia="Times New Roman" w:hAnsi="Times New Roman" w:cs="Times New Roman"/>
                 <w:lang w:val="en-IN" w:bidi="te-IN"/>
               </w:rPr>
-              <w:t>Intro-Middleware-</w:t>
-            </w:r>
-            <w:proofErr w:type="spellStart"/>
+              <w:t>Intro-Middleware-Web</w:t>
+            </w:r>
             <w:r>
               <w:rPr>
                 <w:rFonts w:ascii="Times New Roman" w:eastAsia="Times New Roman" w:hAnsi="Times New Roman" w:cs="Times New Roman"/>
                 <w:lang w:val="en-IN" w:bidi="te-IN"/>
               </w:rPr>
-              <w:t>Web</w:t>
-            </w:r>
-            <w:r>
-              <w:rPr>
-                <w:rFonts w:ascii="Times New Roman" w:eastAsia="Times New Roman" w:hAnsi="Times New Roman" w:cs="Times New Roman"/>
-                <w:lang w:val="en-IN" w:bidi="te-IN"/>
-              </w:rPr>
-              <w:t>,SOA</w:t>
-            </w:r>
-            <w:proofErr w:type="spellEnd"/>
-            <w:r>
-              <w:rPr>
-                <w:rFonts w:ascii="Times New Roman" w:eastAsia="Times New Roman" w:hAnsi="Times New Roman" w:cs="Times New Roman"/>
-                <w:lang w:val="en-IN" w:bidi="te-IN"/>
-              </w:rPr>
-              <w:t xml:space="preserve"> and Web Services</w:t>
+              <w:t>,SOA and Web Services</w:t>
             </w:r>
           </w:p>
         </w:tc>
@@ -7001,7 +6895,7 @@
                 <w:lang w:bidi="te-IN"/>
               </w:rPr>
             </w:pPr>
-            <w:hyperlink r:id="rId7" w:history="1">
+            <w:hyperlink r:id="rId10" w:history="1">
               <w:r>
                 <w:rPr>
                   <w:rFonts w:ascii="Times New Roman" w:eastAsia="Times New Roman" w:hAnsi="Times New Roman" w:cs="Times New Roman"/>
@@ -7023,7 +6917,7 @@
                 <w:lang w:bidi="te-IN"/>
               </w:rPr>
             </w:pPr>
-            <w:hyperlink r:id="rId8" w:history="1">
+            <w:hyperlink r:id="rId11" w:history="1">
               <w:r>
                 <w:rPr>
                   <w:rFonts w:ascii="Times New Roman" w:eastAsia="Times New Roman" w:hAnsi="Times New Roman" w:cs="Times New Roman"/>
@@ -7125,17 +7019,8 @@
                 <w:rFonts w:ascii="Times New Roman" w:eastAsia="Times New Roman" w:hAnsi="Times New Roman" w:cs="Times New Roman"/>
                 <w:lang w:val="en-IN" w:bidi="te-IN"/>
               </w:rPr>
-              <w:t>Non-REST-</w:t>
-            </w:r>
-            <w:proofErr w:type="spellStart"/>
-            <w:r>
-              <w:rPr>
-                <w:rFonts w:ascii="Times New Roman" w:eastAsia="Times New Roman" w:hAnsi="Times New Roman" w:cs="Times New Roman"/>
-                <w:lang w:val="en-IN" w:bidi="te-IN"/>
-              </w:rPr>
-              <w:t>WebServices</w:t>
-            </w:r>
-            <w:proofErr w:type="spellEnd"/>
+              <w:t>Non-REST-WebServices</w:t>
+            </w:r>
             <w:r>
               <w:rPr>
                 <w:rFonts w:ascii="Times New Roman" w:eastAsia="Times New Roman" w:hAnsi="Times New Roman" w:cs="Times New Roman"/>
@@ -7236,17 +7121,8 @@
                 <w:rFonts w:ascii="Times New Roman" w:eastAsia="Times New Roman" w:hAnsi="Times New Roman" w:cs="Times New Roman"/>
                 <w:lang w:val="en-IN" w:bidi="te-IN"/>
               </w:rPr>
-              <w:t>REST-</w:t>
-            </w:r>
-            <w:proofErr w:type="spellStart"/>
-            <w:r>
-              <w:rPr>
-                <w:rFonts w:ascii="Times New Roman" w:eastAsia="Times New Roman" w:hAnsi="Times New Roman" w:cs="Times New Roman"/>
-                <w:lang w:val="en-IN" w:bidi="te-IN"/>
-              </w:rPr>
-              <w:t>WebServices</w:t>
-            </w:r>
-            <w:proofErr w:type="spellEnd"/>
+              <w:t>REST-WebServices</w:t>
+            </w:r>
           </w:p>
         </w:tc>
         <w:tc>
@@ -7337,21 +7213,12 @@
                 <w:lang w:bidi="te-IN"/>
               </w:rPr>
             </w:pPr>
-            <w:proofErr w:type="spellStart"/>
             <w:r>
               <w:rPr>
                 <w:rFonts w:ascii="Times New Roman" w:eastAsia="Times New Roman" w:hAnsi="Times New Roman" w:cs="Times New Roman"/>
                 <w:lang w:val="en-IN" w:bidi="te-IN"/>
               </w:rPr>
-              <w:t>CloudMiddleware</w:t>
-            </w:r>
-            <w:proofErr w:type="spellEnd"/>
-            <w:r>
-              <w:rPr>
-                <w:rFonts w:ascii="Times New Roman" w:eastAsia="Times New Roman" w:hAnsi="Times New Roman" w:cs="Times New Roman"/>
-                <w:lang w:val="en-IN" w:bidi="te-IN"/>
-              </w:rPr>
-              <w:t>-AWS</w:t>
+              <w:t>CloudMiddleware-AWS</w:t>
             </w:r>
             <w:r>
               <w:rPr>
@@ -8674,7 +8541,6 @@
               <w:br/>
               <w:t xml:space="preserve">d. Examples or Exercises - Recommends </w:t>
             </w:r>
-            <w:proofErr w:type="spellStart"/>
             <w:r>
               <w:rPr>
                 <w:rFonts w:ascii="Times New Roman" w:eastAsia="Times New Roman" w:hAnsi="Times New Roman" w:cs="Times New Roman"/>
@@ -8683,7 +8549,6 @@
               <w:lastRenderedPageBreak/>
               <w:t>memcached</w:t>
             </w:r>
-            <w:proofErr w:type="spellEnd"/>
           </w:p>
         </w:tc>
         <w:tc>
@@ -10560,23 +10425,7 @@
                 <w:rFonts w:ascii="Times New Roman" w:eastAsia="Ubuntu" w:hAnsi="Times New Roman" w:cs="Times New Roman"/>
                 <w:color w:val="00000A"/>
               </w:rPr>
-              <w:t xml:space="preserve">Example showing Camel using </w:t>
-            </w:r>
-            <w:proofErr w:type="spellStart"/>
-            <w:r>
-              <w:rPr>
-                <w:rFonts w:ascii="Times New Roman" w:eastAsia="Ubuntu" w:hAnsi="Times New Roman" w:cs="Times New Roman"/>
-                <w:color w:val="00000A"/>
-              </w:rPr>
-              <w:t>DataBase</w:t>
-            </w:r>
-            <w:proofErr w:type="spellEnd"/>
-            <w:r>
-              <w:rPr>
-                <w:rFonts w:ascii="Times New Roman" w:eastAsia="Ubuntu" w:hAnsi="Times New Roman" w:cs="Times New Roman"/>
-                <w:color w:val="00000A"/>
-              </w:rPr>
-              <w:t xml:space="preserve"> (NoSQL</w:t>
+              <w:t>Example showing Camel using DataBase (NoSQL</w:t>
             </w:r>
           </w:p>
           <w:p>
@@ -10655,7 +10504,7 @@
 </file>
 
 <file path=word/numbering.xml><?xml version="1.0" encoding="utf-8"?>
-<w:numbering xmlns:wpc="http://schemas.microsoft.com/office/word/2010/wordprocessingCanvas" xmlns:mc="http://schemas.openxmlformats.org/markup-compatibility/2006" xmlns:o="urn:schemas-microsoft-com:office:office" xmlns:r="http://schemas.openxmlformats.org/officeDocument/2006/relationships" xmlns:m="http://schemas.openxmlformats.org/officeDocument/2006/math" xmlns:v="urn:schemas-microsoft-com:vml" xmlns:wp14="http://schemas.microsoft.com/office/word/2010/wordprocessingDrawing" xmlns:wp="http://schemas.openxmlformats.org/drawingml/2006/wordprocessingDrawing" xmlns:w10="urn:schemas-microsoft-com:office:word" xmlns:w="http://schemas.openxmlformats.org/wordprocessingml/2006/main" xmlns:w14="http://schemas.microsoft.com/office/word/2010/wordml" xmlns:w15="http://schemas.microsoft.com/office/word/2012/wordml" xmlns:wpg="http://schemas.microsoft.com/office/word/2010/wordprocessingGroup" xmlns:wpi="http://schemas.microsoft.com/office/word/2010/wordprocessingInk" xmlns:wne="http://schemas.microsoft.com/office/word/2006/wordml" xmlns:wps="http://schemas.microsoft.com/office/word/2010/wordprocessingShape" mc:Ignorable="w14 w15 wp14">
+<w:numbering xmlns:wpc="http://schemas.microsoft.com/office/word/2010/wordprocessingCanvas" xmlns:cx="http://schemas.microsoft.com/office/drawing/2014/chartex" xmlns:cx1="http://schemas.microsoft.com/office/drawing/2015/9/8/chartex" xmlns:cx2="http://schemas.microsoft.com/office/drawing/2015/10/21/chartex" xmlns:cx3="http://schemas.microsoft.com/office/drawing/2016/5/9/chartex" xmlns:cx4="http://schemas.microsoft.com/office/drawing/2016/5/10/chartex" xmlns:cx5="http://schemas.microsoft.com/office/drawing/2016/5/11/chartex" xmlns:cx6="http://schemas.microsoft.com/office/drawing/2016/5/12/chartex" xmlns:cx7="http://schemas.microsoft.com/office/drawing/2016/5/13/chartex" xmlns:cx8="http://schemas.microsoft.com/office/drawing/2016/5/14/chartex" xmlns:mc="http://schemas.openxmlformats.org/markup-compatibility/2006" xmlns:aink="http://schemas.microsoft.com/office/drawing/2016/ink" xmlns:am3d="http://schemas.microsoft.com/office/drawing/2017/model3d" xmlns:o="urn:schemas-microsoft-com:office:office" xmlns:oel="http://schemas.microsoft.com/office/2019/extlst" xmlns:r="http://schemas.openxmlformats.org/officeDocument/2006/relationships" xmlns:m="http://schemas.openxmlformats.org/officeDocument/2006/math" xmlns:v="urn:schemas-microsoft-com:vml" xmlns:wp14="http://schemas.microsoft.com/office/word/2010/wordprocessingDrawing" xmlns:wp="http://schemas.openxmlformats.org/drawingml/2006/wordprocessingDrawing" xmlns:w10="urn:schemas-microsoft-com:office:word" xmlns:w="http://schemas.openxmlformats.org/wordprocessingml/2006/main" xmlns:w14="http://schemas.microsoft.com/office/word/2010/wordml" xmlns:w15="http://schemas.microsoft.com/office/word/2012/wordml" xmlns:w16cex="http://schemas.microsoft.com/office/word/2018/wordml/cex" xmlns:w16cid="http://schemas.microsoft.com/office/word/2016/wordml/cid" xmlns:w16="http://schemas.microsoft.com/office/word/2018/wordml" xmlns:w16du="http://schemas.microsoft.com/office/word/2023/wordml/word16du" xmlns:w16sdtdh="http://schemas.microsoft.com/office/word/2020/wordml/sdtdatahash" xmlns:w16sdtfl="http://schemas.microsoft.com/office/word/2024/wordml/sdtformatlock" xmlns:w16se="http://schemas.microsoft.com/office/word/2015/wordml/symex" xmlns:wpg="http://schemas.microsoft.com/office/word/2010/wordprocessingGroup" xmlns:wpi="http://schemas.microsoft.com/office/word/2010/wordprocessingInk" xmlns:wne="http://schemas.microsoft.com/office/word/2006/wordml" xmlns:wps="http://schemas.microsoft.com/office/word/2010/wordprocessingShape" mc:Ignorable="w14 w15 w16se w16cid w16 w16cex w16sdtdh w16sdtfl w16du wp14">
   <w:abstractNum w:abstractNumId="0" w15:restartNumberingAfterBreak="0">
     <w:nsid w:val="1AE16457"/>
     <w:multiLevelType w:val="hybridMultilevel"/>
@@ -11700,41 +11549,41 @@
       </w:rPr>
     </w:lvl>
   </w:abstractNum>
-  <w:num w:numId="1">
+  <w:num w:numId="1" w16cid:durableId="1618834034">
     <w:abstractNumId w:val="1"/>
     <w:lvlOverride w:ilvl="0">
       <w:startOverride w:val="1"/>
     </w:lvlOverride>
   </w:num>
-  <w:num w:numId="2">
+  <w:num w:numId="2" w16cid:durableId="1048451727">
     <w:abstractNumId w:val="6"/>
   </w:num>
-  <w:num w:numId="3">
+  <w:num w:numId="3" w16cid:durableId="49883530">
     <w:abstractNumId w:val="0"/>
   </w:num>
-  <w:num w:numId="4">
+  <w:num w:numId="4" w16cid:durableId="1383795820">
     <w:abstractNumId w:val="3"/>
   </w:num>
-  <w:num w:numId="5">
+  <w:num w:numId="5" w16cid:durableId="665785546">
     <w:abstractNumId w:val="5"/>
   </w:num>
-  <w:num w:numId="6">
+  <w:num w:numId="6" w16cid:durableId="1009411698">
     <w:abstractNumId w:val="8"/>
   </w:num>
-  <w:num w:numId="7">
+  <w:num w:numId="7" w16cid:durableId="2116629301">
     <w:abstractNumId w:val="4"/>
   </w:num>
-  <w:num w:numId="8">
+  <w:num w:numId="8" w16cid:durableId="1953321010">
     <w:abstractNumId w:val="2"/>
   </w:num>
-  <w:num w:numId="9">
+  <w:num w:numId="9" w16cid:durableId="1701204605">
     <w:abstractNumId w:val="7"/>
   </w:num>
 </w:numbering>
 </file>
 
 <file path=word/styles.xml><?xml version="1.0" encoding="utf-8"?>
-<w:styles xmlns:mc="http://schemas.openxmlformats.org/markup-compatibility/2006" xmlns:r="http://schemas.openxmlformats.org/officeDocument/2006/relationships" xmlns:w="http://schemas.openxmlformats.org/wordprocessingml/2006/main" xmlns:w14="http://schemas.microsoft.com/office/word/2010/wordml" xmlns:w15="http://schemas.microsoft.com/office/word/2012/wordml" mc:Ignorable="w14 w15">
+<w:styles xmlns:mc="http://schemas.openxmlformats.org/markup-compatibility/2006" xmlns:r="http://schemas.openxmlformats.org/officeDocument/2006/relationships" xmlns:w="http://schemas.openxmlformats.org/wordprocessingml/2006/main" xmlns:w14="http://schemas.microsoft.com/office/word/2010/wordml" xmlns:w15="http://schemas.microsoft.com/office/word/2012/wordml" xmlns:w16cex="http://schemas.microsoft.com/office/word/2018/wordml/cex" xmlns:w16cid="http://schemas.microsoft.com/office/word/2016/wordml/cid" xmlns:w16="http://schemas.microsoft.com/office/word/2018/wordml" xmlns:w16du="http://schemas.microsoft.com/office/word/2023/wordml/word16du" xmlns:w16sdtdh="http://schemas.microsoft.com/office/word/2020/wordml/sdtdatahash" xmlns:w16sdtfl="http://schemas.microsoft.com/office/word/2024/wordml/sdtformatlock" xmlns:w16se="http://schemas.microsoft.com/office/word/2015/wordml/symex" mc:Ignorable="w14 w15 w16se w16cid w16 w16cex w16sdtdh w16sdtfl w16du">
   <w:docDefaults>
     <w:rPrDefault>
       <w:rPr>
@@ -11750,7 +11599,7 @@
       </w:pPr>
     </w:pPrDefault>
   </w:docDefaults>
-  <w:latentStyles w:defLockedState="0" w:defUIPriority="99" w:defSemiHidden="0" w:defUnhideWhenUsed="0" w:defQFormat="0" w:count="371">
+  <w:latentStyles w:defLockedState="0" w:defUIPriority="99" w:defSemiHidden="0" w:defUnhideWhenUsed="0" w:defQFormat="0" w:count="376">
     <w:lsdException w:name="Normal" w:uiPriority="0" w:qFormat="1"/>
     <w:lsdException w:name="heading 1" w:uiPriority="9" w:qFormat="1"/>
     <w:lsdException w:name="heading 2" w:semiHidden="1" w:unhideWhenUsed="1" w:qFormat="1"/>
@@ -12122,6 +11971,11 @@
     <w:lsdException w:name="List Table 5 Dark Accent 6" w:uiPriority="50"/>
     <w:lsdException w:name="List Table 6 Colorful Accent 6" w:uiPriority="51"/>
     <w:lsdException w:name="List Table 7 Colorful Accent 6" w:uiPriority="52"/>
+    <w:lsdException w:name="Mention" w:semiHidden="1" w:unhideWhenUsed="1"/>
+    <w:lsdException w:name="Smart Hyperlink" w:semiHidden="1" w:unhideWhenUsed="1"/>
+    <w:lsdException w:name="Hashtag" w:semiHidden="1" w:unhideWhenUsed="1"/>
+    <w:lsdException w:name="Unresolved Mention" w:semiHidden="1" w:unhideWhenUsed="1"/>
+    <w:lsdException w:name="Smart Link" w:semiHidden="1" w:unhideWhenUsed="1"/>
   </w:latentStyles>
   <w:style w:type="paragraph" w:default="1" w:styleId="Normal">
     <w:name w:val="Normal"/>
@@ -12733,6 +12587,12 @@
 </file>
 
 <file path=customXml/item2.xml><?xml version="1.0" encoding="utf-8"?>
+<p:properties xmlns:p="http://schemas.microsoft.com/office/2006/metadata/properties" xmlns:xsi="http://www.w3.org/2001/XMLSchema-instance" xmlns:pc="http://schemas.microsoft.com/office/infopath/2007/PartnerControls">
+  <documentManagement/>
+</p:properties>
+</file>
+
+<file path=customXml/item3.xml><?xml version="1.0" encoding="utf-8"?>
 <?mso-contentType ?>
 <FormTemplates xmlns="http://schemas.microsoft.com/sharepoint/v3/contenttype/forms">
   <Display>DocumentLibraryForm</Display>
@@ -12741,20 +12601,37 @@
 </FormTemplates>
 </file>
 
-<file path=customXml/item3.xml><?xml version="1.0" encoding="utf-8"?>
-<p:properties xmlns:p="http://schemas.microsoft.com/office/2006/metadata/properties" xmlns:xsi="http://www.w3.org/2001/XMLSchema-instance" xmlns:pc="http://schemas.microsoft.com/office/infopath/2007/PartnerControls">
-  <documentManagement/>
-</p:properties>
-</file>
-
 <file path=customXml/itemProps1.xml><?xml version="1.0" encoding="utf-8"?>
-<ds:datastoreItem xmlns:ds="http://schemas.openxmlformats.org/officeDocument/2006/customXml" ds:itemID="{A46208DF-1870-4C27-B10D-84FE5634645C}"/>
+<ds:datastoreItem xmlns:ds="http://schemas.openxmlformats.org/officeDocument/2006/customXml" ds:itemID="{A46208DF-1870-4C27-B10D-84FE5634645C}">
+  <ds:schemaRefs>
+    <ds:schemaRef ds:uri="http://schemas.microsoft.com/office/2006/metadata/contentType"/>
+    <ds:schemaRef ds:uri="http://schemas.microsoft.com/office/2006/metadata/properties/metaAttributes"/>
+    <ds:schemaRef ds:uri="http://www.w3.org/2001/XMLSchema"/>
+    <ds:schemaRef ds:uri="http://schemas.microsoft.com/office/2006/metadata/properties"/>
+    <ds:schemaRef ds:uri="c6bb6142-e713-4aa4-8224-fc120fe0fe64"/>
+    <ds:schemaRef ds:uri="http://schemas.microsoft.com/office/2006/documentManagement/types"/>
+    <ds:schemaRef ds:uri="http://schemas.microsoft.com/office/infopath/2007/PartnerControls"/>
+    <ds:schemaRef ds:uri="http://schemas.openxmlformats.org/package/2006/metadata/core-properties"/>
+    <ds:schemaRef ds:uri="http://purl.org/dc/elements/1.1/"/>
+    <ds:schemaRef ds:uri="http://purl.org/dc/terms/"/>
+    <ds:schemaRef ds:uri="http://schemas.microsoft.com/internal/obd"/>
+  </ds:schemaRefs>
+</ds:datastoreItem>
 </file>
 
 <file path=customXml/itemProps2.xml><?xml version="1.0" encoding="utf-8"?>
-<ds:datastoreItem xmlns:ds="http://schemas.openxmlformats.org/officeDocument/2006/customXml" ds:itemID="{90A1C45E-74D4-46AC-A015-78DA0984F044}"/>
+<ds:datastoreItem xmlns:ds="http://schemas.openxmlformats.org/officeDocument/2006/customXml" ds:itemID="{D59B481A-CD55-4169-B1D0-BDE6DCD9EE43}">
+  <ds:schemaRefs>
+    <ds:schemaRef ds:uri="http://schemas.microsoft.com/office/2006/metadata/properties"/>
+    <ds:schemaRef ds:uri="http://schemas.microsoft.com/office/infopath/2007/PartnerControls"/>
+  </ds:schemaRefs>
+</ds:datastoreItem>
 </file>
 
 <file path=customXml/itemProps3.xml><?xml version="1.0" encoding="utf-8"?>
-<ds:datastoreItem xmlns:ds="http://schemas.openxmlformats.org/officeDocument/2006/customXml" ds:itemID="{D59B481A-CD55-4169-B1D0-BDE6DCD9EE43}"/>
+<ds:datastoreItem xmlns:ds="http://schemas.openxmlformats.org/officeDocument/2006/customXml" ds:itemID="{90A1C45E-74D4-46AC-A015-78DA0984F044}">
+  <ds:schemaRefs>
+    <ds:schemaRef ds:uri="http://schemas.microsoft.com/sharepoint/v3/contenttype/forms"/>
+  </ds:schemaRefs>
+</ds:datastoreItem>
 </file>
</xml_diff>